<commit_message>
updated notes for notification
</commit_message>
<xml_diff>
--- a/Notes/Notifications_note.docx
+++ b/Notes/Notifications_note.docx
@@ -787,8 +787,6 @@
           <w:tab w:val="left" w:pos="6525"/>
         </w:tabs>
       </w:pPr>
-      <w:bookmarkStart w:id="0" w:name="_GoBack"/>
-      <w:bookmarkEnd w:id="0"/>
     </w:p>
     <w:p>
       <w:pPr>
@@ -796,12 +794,846 @@
           <w:tab w:val="left" w:pos="6525"/>
         </w:tabs>
       </w:pPr>
+      <w:bookmarkStart w:id="0" w:name="_GoBack"/>
+      <w:bookmarkEnd w:id="0"/>
     </w:p>
     <w:p>
       <w:pPr>
         <w:tabs>
           <w:tab w:val="left" w:pos="6525"/>
         </w:tabs>
+      </w:pPr>
+    </w:p>
+    <w:p>
+      <w:pPr>
+        <w:shd w:val="clear" w:color="auto" w:fill="2B2B2B"/>
+        <w:tabs>
+          <w:tab w:val="left" w:pos="916"/>
+          <w:tab w:val="left" w:pos="1832"/>
+          <w:tab w:val="left" w:pos="2748"/>
+          <w:tab w:val="left" w:pos="3664"/>
+          <w:tab w:val="left" w:pos="4580"/>
+          <w:tab w:val="left" w:pos="5496"/>
+          <w:tab w:val="left" w:pos="6412"/>
+          <w:tab w:val="left" w:pos="7328"/>
+          <w:tab w:val="left" w:pos="8244"/>
+          <w:tab w:val="left" w:pos="9160"/>
+          <w:tab w:val="left" w:pos="10076"/>
+          <w:tab w:val="left" w:pos="10992"/>
+          <w:tab w:val="left" w:pos="11908"/>
+          <w:tab w:val="left" w:pos="12824"/>
+          <w:tab w:val="left" w:pos="13740"/>
+          <w:tab w:val="left" w:pos="14656"/>
+        </w:tabs>
+        <w:spacing w:after="0" w:line="240" w:lineRule="auto"/>
+        <w:rPr>
+          <w:rFonts w:ascii="Courier New" w:eastAsia="Times New Roman" w:hAnsi="Courier New" w:cs="Courier New"/>
+          <w:color w:val="A9B7C6"/>
+          <w:sz w:val="20"/>
+          <w:szCs w:val="20"/>
+          <w:lang w:eastAsia="en-IN"/>
+        </w:rPr>
+      </w:pPr>
+      <w:r>
+        <w:rPr>
+          <w:rFonts w:ascii="Courier New" w:eastAsia="Times New Roman" w:hAnsi="Courier New" w:cs="Courier New"/>
+          <w:color w:val="A9B7C6"/>
+          <w:sz w:val="20"/>
+          <w:szCs w:val="20"/>
+          <w:lang w:eastAsia="en-IN"/>
+        </w:rPr>
+        <w:t xml:space="preserve">    </w:t>
+      </w:r>
+      <w:r>
+        <w:rPr>
+          <w:rFonts w:ascii="Courier New" w:eastAsia="Times New Roman" w:hAnsi="Courier New" w:cs="Courier New"/>
+          <w:color w:val="CC7832"/>
+          <w:sz w:val="20"/>
+          <w:szCs w:val="20"/>
+          <w:lang w:eastAsia="en-IN"/>
+        </w:rPr>
+        <w:t xml:space="preserve">public void </w:t>
+      </w:r>
+      <w:r>
+        <w:rPr>
+          <w:rFonts w:ascii="Courier New" w:eastAsia="Times New Roman" w:hAnsi="Courier New" w:cs="Courier New"/>
+          <w:color w:val="FFC66D"/>
+          <w:sz w:val="20"/>
+          <w:szCs w:val="20"/>
+          <w:lang w:eastAsia="en-IN"/>
+        </w:rPr>
+        <w:t>notify</w:t>
+      </w:r>
+      <w:r>
+        <w:rPr>
+          <w:rFonts w:ascii="Courier New" w:eastAsia="Times New Roman" w:hAnsi="Courier New" w:cs="Courier New"/>
+          <w:color w:val="A9B7C6"/>
+          <w:sz w:val="20"/>
+          <w:szCs w:val="20"/>
+          <w:lang w:eastAsia="en-IN"/>
+        </w:rPr>
+        <w:t>(View v){</w:t>
+      </w:r>
+      <w:r>
+        <w:rPr>
+          <w:rFonts w:ascii="Courier New" w:eastAsia="Times New Roman" w:hAnsi="Courier New" w:cs="Courier New"/>
+          <w:color w:val="A9B7C6"/>
+          <w:sz w:val="20"/>
+          <w:szCs w:val="20"/>
+          <w:lang w:eastAsia="en-IN"/>
+        </w:rPr>
+        <w:br/>
+        <w:t xml:space="preserve">        </w:t>
+      </w:r>
+      <w:r>
+        <w:rPr>
+          <w:rFonts w:ascii="Courier New" w:eastAsia="Times New Roman" w:hAnsi="Courier New" w:cs="Courier New"/>
+          <w:color w:val="808080"/>
+          <w:sz w:val="20"/>
+          <w:szCs w:val="20"/>
+          <w:lang w:eastAsia="en-IN"/>
+        </w:rPr>
+        <w:t>//build and display notification</w:t>
+      </w:r>
+      <w:r>
+        <w:rPr>
+          <w:rFonts w:ascii="Courier New" w:eastAsia="Times New Roman" w:hAnsi="Courier New" w:cs="Courier New"/>
+          <w:color w:val="808080"/>
+          <w:sz w:val="20"/>
+          <w:szCs w:val="20"/>
+          <w:lang w:eastAsia="en-IN"/>
+        </w:rPr>
+        <w:br/>
+        <w:t xml:space="preserve">        </w:t>
+      </w:r>
+      <w:proofErr w:type="spellStart"/>
+      <w:r>
+        <w:rPr>
+          <w:rFonts w:ascii="Courier New" w:eastAsia="Times New Roman" w:hAnsi="Courier New" w:cs="Courier New"/>
+          <w:color w:val="A9B7C6"/>
+          <w:sz w:val="20"/>
+          <w:szCs w:val="20"/>
+          <w:lang w:eastAsia="en-IN"/>
+        </w:rPr>
+        <w:t>NotificationCompat</w:t>
+      </w:r>
+      <w:proofErr w:type="spellEnd"/>
+      <w:r>
+        <w:rPr>
+          <w:rFonts w:ascii="Courier New" w:eastAsia="Times New Roman" w:hAnsi="Courier New" w:cs="Courier New"/>
+          <w:color w:val="A9B7C6"/>
+          <w:sz w:val="20"/>
+          <w:szCs w:val="20"/>
+          <w:lang w:eastAsia="en-IN"/>
+        </w:rPr>
+        <w:t xml:space="preserve"> .Builder builder=</w:t>
+      </w:r>
+      <w:r>
+        <w:rPr>
+          <w:rFonts w:ascii="Courier New" w:eastAsia="Times New Roman" w:hAnsi="Courier New" w:cs="Courier New"/>
+          <w:color w:val="CC7832"/>
+          <w:sz w:val="20"/>
+          <w:szCs w:val="20"/>
+          <w:lang w:eastAsia="en-IN"/>
+        </w:rPr>
+        <w:t xml:space="preserve">new </w:t>
+      </w:r>
+      <w:proofErr w:type="spellStart"/>
+      <w:r>
+        <w:rPr>
+          <w:rFonts w:ascii="Courier New" w:eastAsia="Times New Roman" w:hAnsi="Courier New" w:cs="Courier New"/>
+          <w:color w:val="A9B7C6"/>
+          <w:sz w:val="20"/>
+          <w:szCs w:val="20"/>
+          <w:lang w:eastAsia="en-IN"/>
+        </w:rPr>
+        <w:lastRenderedPageBreak/>
+        <w:t>NotificationCompat.Builder</w:t>
+      </w:r>
+      <w:proofErr w:type="spellEnd"/>
+      <w:r>
+        <w:rPr>
+          <w:rFonts w:ascii="Courier New" w:eastAsia="Times New Roman" w:hAnsi="Courier New" w:cs="Courier New"/>
+          <w:color w:val="A9B7C6"/>
+          <w:sz w:val="20"/>
+          <w:szCs w:val="20"/>
+          <w:lang w:eastAsia="en-IN"/>
+        </w:rPr>
+        <w:t>(</w:t>
+      </w:r>
+      <w:proofErr w:type="spellStart"/>
+      <w:r>
+        <w:rPr>
+          <w:rFonts w:ascii="Courier New" w:eastAsia="Times New Roman" w:hAnsi="Courier New" w:cs="Courier New"/>
+          <w:color w:val="CC7832"/>
+          <w:sz w:val="20"/>
+          <w:szCs w:val="20"/>
+          <w:lang w:eastAsia="en-IN"/>
+        </w:rPr>
+        <w:t>this,</w:t>
+      </w:r>
+      <w:r>
+        <w:rPr>
+          <w:rFonts w:ascii="Courier New" w:eastAsia="Times New Roman" w:hAnsi="Courier New" w:cs="Courier New"/>
+          <w:i/>
+          <w:iCs/>
+          <w:color w:val="9876AA"/>
+          <w:sz w:val="20"/>
+          <w:szCs w:val="20"/>
+          <w:lang w:eastAsia="en-IN"/>
+        </w:rPr>
+        <w:t>CHANNEL_ID</w:t>
+      </w:r>
+      <w:proofErr w:type="spellEnd"/>
+      <w:r>
+        <w:rPr>
+          <w:rFonts w:ascii="Courier New" w:eastAsia="Times New Roman" w:hAnsi="Courier New" w:cs="Courier New"/>
+          <w:color w:val="A9B7C6"/>
+          <w:sz w:val="20"/>
+          <w:szCs w:val="20"/>
+          <w:lang w:eastAsia="en-IN"/>
+        </w:rPr>
+        <w:t>)</w:t>
+      </w:r>
+      <w:r>
+        <w:rPr>
+          <w:rFonts w:ascii="Courier New" w:eastAsia="Times New Roman" w:hAnsi="Courier New" w:cs="Courier New"/>
+          <w:color w:val="A9B7C6"/>
+          <w:sz w:val="20"/>
+          <w:szCs w:val="20"/>
+          <w:lang w:eastAsia="en-IN"/>
+        </w:rPr>
+        <w:br/>
+        <w:t xml:space="preserve">                .</w:t>
+      </w:r>
+      <w:proofErr w:type="spellStart"/>
+      <w:r>
+        <w:rPr>
+          <w:rFonts w:ascii="Courier New" w:eastAsia="Times New Roman" w:hAnsi="Courier New" w:cs="Courier New"/>
+          <w:color w:val="A9B7C6"/>
+          <w:sz w:val="20"/>
+          <w:szCs w:val="20"/>
+          <w:lang w:eastAsia="en-IN"/>
+        </w:rPr>
+        <w:t>setSmallIcon</w:t>
+      </w:r>
+      <w:proofErr w:type="spellEnd"/>
+      <w:r>
+        <w:rPr>
+          <w:rFonts w:ascii="Courier New" w:eastAsia="Times New Roman" w:hAnsi="Courier New" w:cs="Courier New"/>
+          <w:color w:val="A9B7C6"/>
+          <w:sz w:val="20"/>
+          <w:szCs w:val="20"/>
+          <w:lang w:eastAsia="en-IN"/>
+        </w:rPr>
+        <w:t>(</w:t>
+      </w:r>
+      <w:proofErr w:type="spellStart"/>
+      <w:r>
+        <w:rPr>
+          <w:rFonts w:ascii="Courier New" w:eastAsia="Times New Roman" w:hAnsi="Courier New" w:cs="Courier New"/>
+          <w:color w:val="A9B7C6"/>
+          <w:sz w:val="20"/>
+          <w:szCs w:val="20"/>
+          <w:lang w:eastAsia="en-IN"/>
+        </w:rPr>
+        <w:t>R.drawable.</w:t>
+      </w:r>
+      <w:r>
+        <w:rPr>
+          <w:rFonts w:ascii="Courier New" w:eastAsia="Times New Roman" w:hAnsi="Courier New" w:cs="Courier New"/>
+          <w:i/>
+          <w:iCs/>
+          <w:color w:val="9876AA"/>
+          <w:sz w:val="20"/>
+          <w:szCs w:val="20"/>
+          <w:lang w:eastAsia="en-IN"/>
+        </w:rPr>
+        <w:t>notif</w:t>
+      </w:r>
+      <w:proofErr w:type="spellEnd"/>
+      <w:r>
+        <w:rPr>
+          <w:rFonts w:ascii="Courier New" w:eastAsia="Times New Roman" w:hAnsi="Courier New" w:cs="Courier New"/>
+          <w:color w:val="A9B7C6"/>
+          <w:sz w:val="20"/>
+          <w:szCs w:val="20"/>
+          <w:lang w:eastAsia="en-IN"/>
+        </w:rPr>
+        <w:t>)</w:t>
+      </w:r>
+      <w:r>
+        <w:rPr>
+          <w:rFonts w:ascii="Courier New" w:eastAsia="Times New Roman" w:hAnsi="Courier New" w:cs="Courier New"/>
+          <w:color w:val="A9B7C6"/>
+          <w:sz w:val="20"/>
+          <w:szCs w:val="20"/>
+          <w:lang w:eastAsia="en-IN"/>
+        </w:rPr>
+        <w:br/>
+        <w:t xml:space="preserve">                .</w:t>
+      </w:r>
+      <w:proofErr w:type="spellStart"/>
+      <w:r>
+        <w:rPr>
+          <w:rFonts w:ascii="Courier New" w:eastAsia="Times New Roman" w:hAnsi="Courier New" w:cs="Courier New"/>
+          <w:color w:val="A9B7C6"/>
+          <w:sz w:val="20"/>
+          <w:szCs w:val="20"/>
+          <w:lang w:eastAsia="en-IN"/>
+        </w:rPr>
+        <w:t>setContentTitle</w:t>
+      </w:r>
+      <w:proofErr w:type="spellEnd"/>
+      <w:r>
+        <w:rPr>
+          <w:rFonts w:ascii="Courier New" w:eastAsia="Times New Roman" w:hAnsi="Courier New" w:cs="Courier New"/>
+          <w:color w:val="A9B7C6"/>
+          <w:sz w:val="20"/>
+          <w:szCs w:val="20"/>
+          <w:lang w:eastAsia="en-IN"/>
+        </w:rPr>
+        <w:t>(</w:t>
+      </w:r>
+      <w:r>
+        <w:rPr>
+          <w:rFonts w:ascii="Courier New" w:eastAsia="Times New Roman" w:hAnsi="Courier New" w:cs="Courier New"/>
+          <w:color w:val="6A8759"/>
+          <w:sz w:val="20"/>
+          <w:szCs w:val="20"/>
+          <w:lang w:eastAsia="en-IN"/>
+        </w:rPr>
+        <w:t>"Notification"</w:t>
+      </w:r>
+      <w:r>
+        <w:rPr>
+          <w:rFonts w:ascii="Courier New" w:eastAsia="Times New Roman" w:hAnsi="Courier New" w:cs="Courier New"/>
+          <w:color w:val="A9B7C6"/>
+          <w:sz w:val="20"/>
+          <w:szCs w:val="20"/>
+          <w:lang w:eastAsia="en-IN"/>
+        </w:rPr>
+        <w:t>)</w:t>
+      </w:r>
+      <w:r>
+        <w:rPr>
+          <w:rFonts w:ascii="Courier New" w:eastAsia="Times New Roman" w:hAnsi="Courier New" w:cs="Courier New"/>
+          <w:color w:val="A9B7C6"/>
+          <w:sz w:val="20"/>
+          <w:szCs w:val="20"/>
+          <w:lang w:eastAsia="en-IN"/>
+        </w:rPr>
+        <w:br/>
+        <w:t xml:space="preserve">                .</w:t>
+      </w:r>
+      <w:proofErr w:type="spellStart"/>
+      <w:r>
+        <w:rPr>
+          <w:rFonts w:ascii="Courier New" w:eastAsia="Times New Roman" w:hAnsi="Courier New" w:cs="Courier New"/>
+          <w:color w:val="A9B7C6"/>
+          <w:sz w:val="20"/>
+          <w:szCs w:val="20"/>
+          <w:lang w:eastAsia="en-IN"/>
+        </w:rPr>
+        <w:t>setContentText</w:t>
+      </w:r>
+      <w:proofErr w:type="spellEnd"/>
+      <w:r>
+        <w:rPr>
+          <w:rFonts w:ascii="Courier New" w:eastAsia="Times New Roman" w:hAnsi="Courier New" w:cs="Courier New"/>
+          <w:color w:val="A9B7C6"/>
+          <w:sz w:val="20"/>
+          <w:szCs w:val="20"/>
+          <w:lang w:eastAsia="en-IN"/>
+        </w:rPr>
+        <w:t>(</w:t>
+      </w:r>
+      <w:r>
+        <w:rPr>
+          <w:rFonts w:ascii="Courier New" w:eastAsia="Times New Roman" w:hAnsi="Courier New" w:cs="Courier New"/>
+          <w:color w:val="6A8759"/>
+          <w:sz w:val="20"/>
+          <w:szCs w:val="20"/>
+          <w:lang w:eastAsia="en-IN"/>
+        </w:rPr>
+        <w:t xml:space="preserve">" This is A </w:t>
+      </w:r>
+      <w:proofErr w:type="spellStart"/>
+      <w:r>
+        <w:rPr>
+          <w:rFonts w:ascii="Courier New" w:eastAsia="Times New Roman" w:hAnsi="Courier New" w:cs="Courier New"/>
+          <w:color w:val="6A8759"/>
+          <w:sz w:val="20"/>
+          <w:szCs w:val="20"/>
+          <w:lang w:eastAsia="en-IN"/>
+        </w:rPr>
+        <w:t>notifiaction</w:t>
+      </w:r>
+      <w:proofErr w:type="spellEnd"/>
+      <w:r>
+        <w:rPr>
+          <w:rFonts w:ascii="Courier New" w:eastAsia="Times New Roman" w:hAnsi="Courier New" w:cs="Courier New"/>
+          <w:color w:val="6A8759"/>
+          <w:sz w:val="20"/>
+          <w:szCs w:val="20"/>
+          <w:lang w:eastAsia="en-IN"/>
+        </w:rPr>
+        <w:t>"</w:t>
+      </w:r>
+      <w:r>
+        <w:rPr>
+          <w:rFonts w:ascii="Courier New" w:eastAsia="Times New Roman" w:hAnsi="Courier New" w:cs="Courier New"/>
+          <w:color w:val="A9B7C6"/>
+          <w:sz w:val="20"/>
+          <w:szCs w:val="20"/>
+          <w:lang w:eastAsia="en-IN"/>
+        </w:rPr>
+        <w:t>)</w:t>
+      </w:r>
+      <w:r>
+        <w:rPr>
+          <w:rFonts w:ascii="Courier New" w:eastAsia="Times New Roman" w:hAnsi="Courier New" w:cs="Courier New"/>
+          <w:color w:val="A9B7C6"/>
+          <w:sz w:val="20"/>
+          <w:szCs w:val="20"/>
+          <w:lang w:eastAsia="en-IN"/>
+        </w:rPr>
+        <w:br/>
+        <w:t xml:space="preserve">                .</w:t>
+      </w:r>
+      <w:proofErr w:type="spellStart"/>
+      <w:r>
+        <w:rPr>
+          <w:rFonts w:ascii="Courier New" w:eastAsia="Times New Roman" w:hAnsi="Courier New" w:cs="Courier New"/>
+          <w:color w:val="A9B7C6"/>
+          <w:sz w:val="20"/>
+          <w:szCs w:val="20"/>
+          <w:lang w:eastAsia="en-IN"/>
+        </w:rPr>
+        <w:t>setAutoCancel</w:t>
+      </w:r>
+      <w:proofErr w:type="spellEnd"/>
+      <w:r>
+        <w:rPr>
+          <w:rFonts w:ascii="Courier New" w:eastAsia="Times New Roman" w:hAnsi="Courier New" w:cs="Courier New"/>
+          <w:color w:val="A9B7C6"/>
+          <w:sz w:val="20"/>
+          <w:szCs w:val="20"/>
+          <w:lang w:eastAsia="en-IN"/>
+        </w:rPr>
+        <w:t>(</w:t>
+      </w:r>
+      <w:r>
+        <w:rPr>
+          <w:rFonts w:ascii="Courier New" w:eastAsia="Times New Roman" w:hAnsi="Courier New" w:cs="Courier New"/>
+          <w:color w:val="CC7832"/>
+          <w:sz w:val="20"/>
+          <w:szCs w:val="20"/>
+          <w:lang w:eastAsia="en-IN"/>
+        </w:rPr>
+        <w:t>true</w:t>
+      </w:r>
+      <w:r>
+        <w:rPr>
+          <w:rFonts w:ascii="Courier New" w:eastAsia="Times New Roman" w:hAnsi="Courier New" w:cs="Courier New"/>
+          <w:color w:val="A9B7C6"/>
+          <w:sz w:val="20"/>
+          <w:szCs w:val="20"/>
+          <w:lang w:eastAsia="en-IN"/>
+        </w:rPr>
+        <w:t>)</w:t>
+      </w:r>
+      <w:r>
+        <w:rPr>
+          <w:rFonts w:ascii="Courier New" w:eastAsia="Times New Roman" w:hAnsi="Courier New" w:cs="Courier New"/>
+          <w:color w:val="A9B7C6"/>
+          <w:sz w:val="20"/>
+          <w:szCs w:val="20"/>
+          <w:lang w:eastAsia="en-IN"/>
+        </w:rPr>
+        <w:br/>
+        <w:t xml:space="preserve">                .</w:t>
+      </w:r>
+      <w:proofErr w:type="spellStart"/>
+      <w:r>
+        <w:rPr>
+          <w:rFonts w:ascii="Courier New" w:eastAsia="Times New Roman" w:hAnsi="Courier New" w:cs="Courier New"/>
+          <w:color w:val="A9B7C6"/>
+          <w:sz w:val="20"/>
+          <w:szCs w:val="20"/>
+          <w:lang w:eastAsia="en-IN"/>
+        </w:rPr>
+        <w:t>setPriority</w:t>
+      </w:r>
+      <w:proofErr w:type="spellEnd"/>
+      <w:r>
+        <w:rPr>
+          <w:rFonts w:ascii="Courier New" w:eastAsia="Times New Roman" w:hAnsi="Courier New" w:cs="Courier New"/>
+          <w:color w:val="A9B7C6"/>
+          <w:sz w:val="20"/>
+          <w:szCs w:val="20"/>
+          <w:lang w:eastAsia="en-IN"/>
+        </w:rPr>
+        <w:t>(</w:t>
+      </w:r>
+      <w:proofErr w:type="spellStart"/>
+      <w:r>
+        <w:rPr>
+          <w:rFonts w:ascii="Courier New" w:eastAsia="Times New Roman" w:hAnsi="Courier New" w:cs="Courier New"/>
+          <w:color w:val="A9B7C6"/>
+          <w:sz w:val="20"/>
+          <w:szCs w:val="20"/>
+          <w:lang w:eastAsia="en-IN"/>
+        </w:rPr>
+        <w:t>NotificationCompat.</w:t>
+      </w:r>
+      <w:r>
+        <w:rPr>
+          <w:rFonts w:ascii="Courier New" w:eastAsia="Times New Roman" w:hAnsi="Courier New" w:cs="Courier New"/>
+          <w:i/>
+          <w:iCs/>
+          <w:color w:val="9876AA"/>
+          <w:sz w:val="20"/>
+          <w:szCs w:val="20"/>
+          <w:lang w:eastAsia="en-IN"/>
+        </w:rPr>
+        <w:t>PRIORITY_DEFAULT</w:t>
+      </w:r>
+      <w:proofErr w:type="spellEnd"/>
+      <w:r>
+        <w:rPr>
+          <w:rFonts w:ascii="Courier New" w:eastAsia="Times New Roman" w:hAnsi="Courier New" w:cs="Courier New"/>
+          <w:color w:val="A9B7C6"/>
+          <w:sz w:val="20"/>
+          <w:szCs w:val="20"/>
+          <w:lang w:eastAsia="en-IN"/>
+        </w:rPr>
+        <w:t>)</w:t>
+      </w:r>
+      <w:r>
+        <w:rPr>
+          <w:rFonts w:ascii="Courier New" w:eastAsia="Times New Roman" w:hAnsi="Courier New" w:cs="Courier New"/>
+          <w:color w:val="CC7832"/>
+          <w:sz w:val="20"/>
+          <w:szCs w:val="20"/>
+          <w:lang w:eastAsia="en-IN"/>
+        </w:rPr>
+        <w:t>;</w:t>
+      </w:r>
+      <w:r>
+        <w:rPr>
+          <w:rFonts w:ascii="Courier New" w:eastAsia="Times New Roman" w:hAnsi="Courier New" w:cs="Courier New"/>
+          <w:color w:val="CC7832"/>
+          <w:sz w:val="20"/>
+          <w:szCs w:val="20"/>
+          <w:lang w:eastAsia="en-IN"/>
+        </w:rPr>
+        <w:br/>
+        <w:t xml:space="preserve">        </w:t>
+      </w:r>
+      <w:r>
+        <w:rPr>
+          <w:rFonts w:ascii="Courier New" w:eastAsia="Times New Roman" w:hAnsi="Courier New" w:cs="Courier New"/>
+          <w:color w:val="808080"/>
+          <w:sz w:val="20"/>
+          <w:szCs w:val="20"/>
+          <w:lang w:eastAsia="en-IN"/>
+        </w:rPr>
+        <w:t>//.</w:t>
+      </w:r>
+      <w:proofErr w:type="spellStart"/>
+      <w:r>
+        <w:rPr>
+          <w:rFonts w:ascii="Courier New" w:eastAsia="Times New Roman" w:hAnsi="Courier New" w:cs="Courier New"/>
+          <w:color w:val="808080"/>
+          <w:sz w:val="20"/>
+          <w:szCs w:val="20"/>
+          <w:lang w:eastAsia="en-IN"/>
+        </w:rPr>
+        <w:t>setsmall</w:t>
+      </w:r>
+      <w:proofErr w:type="spellEnd"/>
+      <w:r>
+        <w:rPr>
+          <w:rFonts w:ascii="Courier New" w:eastAsia="Times New Roman" w:hAnsi="Courier New" w:cs="Courier New"/>
+          <w:color w:val="808080"/>
+          <w:sz w:val="20"/>
+          <w:szCs w:val="20"/>
+          <w:lang w:eastAsia="en-IN"/>
+        </w:rPr>
+        <w:t xml:space="preserve"> icon is to display </w:t>
+      </w:r>
+      <w:proofErr w:type="spellStart"/>
+      <w:r>
+        <w:rPr>
+          <w:rFonts w:ascii="Courier New" w:eastAsia="Times New Roman" w:hAnsi="Courier New" w:cs="Courier New"/>
+          <w:color w:val="808080"/>
+          <w:sz w:val="20"/>
+          <w:szCs w:val="20"/>
+          <w:lang w:eastAsia="en-IN"/>
+        </w:rPr>
+        <w:t>img</w:t>
+      </w:r>
+      <w:proofErr w:type="spellEnd"/>
+      <w:r>
+        <w:rPr>
+          <w:rFonts w:ascii="Courier New" w:eastAsia="Times New Roman" w:hAnsi="Courier New" w:cs="Courier New"/>
+          <w:color w:val="808080"/>
+          <w:sz w:val="20"/>
+          <w:szCs w:val="20"/>
+          <w:lang w:eastAsia="en-IN"/>
+        </w:rPr>
+        <w:br/>
+        <w:t xml:space="preserve">        </w:t>
+      </w:r>
+      <w:proofErr w:type="spellStart"/>
+      <w:r>
+        <w:rPr>
+          <w:rFonts w:ascii="Courier New" w:eastAsia="Times New Roman" w:hAnsi="Courier New" w:cs="Courier New"/>
+          <w:color w:val="A9B7C6"/>
+          <w:sz w:val="20"/>
+          <w:szCs w:val="20"/>
+          <w:lang w:eastAsia="en-IN"/>
+        </w:rPr>
+        <w:t>NotificationManager</w:t>
+      </w:r>
+      <w:proofErr w:type="spellEnd"/>
+      <w:r>
+        <w:rPr>
+          <w:rFonts w:ascii="Courier New" w:eastAsia="Times New Roman" w:hAnsi="Courier New" w:cs="Courier New"/>
+          <w:color w:val="A9B7C6"/>
+          <w:sz w:val="20"/>
+          <w:szCs w:val="20"/>
+          <w:lang w:eastAsia="en-IN"/>
+        </w:rPr>
+        <w:t xml:space="preserve"> manager=(</w:t>
+      </w:r>
+      <w:proofErr w:type="spellStart"/>
+      <w:r>
+        <w:rPr>
+          <w:rFonts w:ascii="Courier New" w:eastAsia="Times New Roman" w:hAnsi="Courier New" w:cs="Courier New"/>
+          <w:color w:val="A9B7C6"/>
+          <w:sz w:val="20"/>
+          <w:szCs w:val="20"/>
+          <w:lang w:eastAsia="en-IN"/>
+        </w:rPr>
+        <w:t>NotificationManager</w:t>
+      </w:r>
+      <w:proofErr w:type="spellEnd"/>
+      <w:r>
+        <w:rPr>
+          <w:rFonts w:ascii="Courier New" w:eastAsia="Times New Roman" w:hAnsi="Courier New" w:cs="Courier New"/>
+          <w:color w:val="A9B7C6"/>
+          <w:sz w:val="20"/>
+          <w:szCs w:val="20"/>
+          <w:lang w:eastAsia="en-IN"/>
+        </w:rPr>
+        <w:t xml:space="preserve">) </w:t>
+      </w:r>
+      <w:proofErr w:type="spellStart"/>
+      <w:r>
+        <w:rPr>
+          <w:rFonts w:ascii="Courier New" w:eastAsia="Times New Roman" w:hAnsi="Courier New" w:cs="Courier New"/>
+          <w:color w:val="A9B7C6"/>
+          <w:sz w:val="20"/>
+          <w:szCs w:val="20"/>
+          <w:lang w:eastAsia="en-IN"/>
+        </w:rPr>
+        <w:t>getSystemService</w:t>
+      </w:r>
+      <w:proofErr w:type="spellEnd"/>
+      <w:r>
+        <w:rPr>
+          <w:rFonts w:ascii="Courier New" w:eastAsia="Times New Roman" w:hAnsi="Courier New" w:cs="Courier New"/>
+          <w:color w:val="A9B7C6"/>
+          <w:sz w:val="20"/>
+          <w:szCs w:val="20"/>
+          <w:lang w:eastAsia="en-IN"/>
+        </w:rPr>
+        <w:t>(</w:t>
+      </w:r>
+      <w:proofErr w:type="spellStart"/>
+      <w:r>
+        <w:rPr>
+          <w:rFonts w:ascii="Courier New" w:eastAsia="Times New Roman" w:hAnsi="Courier New" w:cs="Courier New"/>
+          <w:color w:val="A9B7C6"/>
+          <w:sz w:val="20"/>
+          <w:szCs w:val="20"/>
+          <w:lang w:eastAsia="en-IN"/>
+        </w:rPr>
+        <w:t>Context.</w:t>
+      </w:r>
+      <w:r>
+        <w:rPr>
+          <w:rFonts w:ascii="Courier New" w:eastAsia="Times New Roman" w:hAnsi="Courier New" w:cs="Courier New"/>
+          <w:i/>
+          <w:iCs/>
+          <w:color w:val="9876AA"/>
+          <w:sz w:val="20"/>
+          <w:szCs w:val="20"/>
+          <w:lang w:eastAsia="en-IN"/>
+        </w:rPr>
+        <w:t>NOTIFICATION_SERVICE</w:t>
+      </w:r>
+      <w:proofErr w:type="spellEnd"/>
+      <w:r>
+        <w:rPr>
+          <w:rFonts w:ascii="Courier New" w:eastAsia="Times New Roman" w:hAnsi="Courier New" w:cs="Courier New"/>
+          <w:color w:val="A9B7C6"/>
+          <w:sz w:val="20"/>
+          <w:szCs w:val="20"/>
+          <w:lang w:eastAsia="en-IN"/>
+        </w:rPr>
+        <w:t>)</w:t>
+      </w:r>
+      <w:r>
+        <w:rPr>
+          <w:rFonts w:ascii="Courier New" w:eastAsia="Times New Roman" w:hAnsi="Courier New" w:cs="Courier New"/>
+          <w:color w:val="CC7832"/>
+          <w:sz w:val="20"/>
+          <w:szCs w:val="20"/>
+          <w:lang w:eastAsia="en-IN"/>
+        </w:rPr>
+        <w:t xml:space="preserve">; </w:t>
+      </w:r>
+      <w:r>
+        <w:rPr>
+          <w:rFonts w:ascii="Courier New" w:eastAsia="Times New Roman" w:hAnsi="Courier New" w:cs="Courier New"/>
+          <w:color w:val="CC7832"/>
+          <w:sz w:val="20"/>
+          <w:szCs w:val="20"/>
+          <w:lang w:eastAsia="en-IN"/>
+        </w:rPr>
+        <w:br/>
+        <w:t xml:space="preserve">        </w:t>
+      </w:r>
+      <w:proofErr w:type="spellStart"/>
+      <w:r>
+        <w:rPr>
+          <w:rFonts w:ascii="Courier New" w:eastAsia="Times New Roman" w:hAnsi="Courier New" w:cs="Courier New"/>
+          <w:color w:val="A9B7C6"/>
+          <w:sz w:val="20"/>
+          <w:szCs w:val="20"/>
+          <w:lang w:eastAsia="en-IN"/>
+        </w:rPr>
+        <w:t>manager.notify</w:t>
+      </w:r>
+      <w:proofErr w:type="spellEnd"/>
+      <w:r>
+        <w:rPr>
+          <w:rFonts w:ascii="Courier New" w:eastAsia="Times New Roman" w:hAnsi="Courier New" w:cs="Courier New"/>
+          <w:color w:val="A9B7C6"/>
+          <w:sz w:val="20"/>
+          <w:szCs w:val="20"/>
+          <w:lang w:eastAsia="en-IN"/>
+        </w:rPr>
+        <w:t>(</w:t>
+      </w:r>
+      <w:r>
+        <w:rPr>
+          <w:rFonts w:ascii="Courier New" w:eastAsia="Times New Roman" w:hAnsi="Courier New" w:cs="Courier New"/>
+          <w:color w:val="6897BB"/>
+          <w:sz w:val="20"/>
+          <w:szCs w:val="20"/>
+          <w:lang w:eastAsia="en-IN"/>
+        </w:rPr>
+        <w:t>1</w:t>
+      </w:r>
+      <w:r>
+        <w:rPr>
+          <w:rFonts w:ascii="Courier New" w:eastAsia="Times New Roman" w:hAnsi="Courier New" w:cs="Courier New"/>
+          <w:color w:val="CC7832"/>
+          <w:sz w:val="20"/>
+          <w:szCs w:val="20"/>
+          <w:lang w:eastAsia="en-IN"/>
+        </w:rPr>
+        <w:t>,</w:t>
+      </w:r>
+      <w:r>
+        <w:rPr>
+          <w:rFonts w:ascii="Courier New" w:eastAsia="Times New Roman" w:hAnsi="Courier New" w:cs="Courier New"/>
+          <w:color w:val="A9B7C6"/>
+          <w:sz w:val="20"/>
+          <w:szCs w:val="20"/>
+          <w:lang w:eastAsia="en-IN"/>
+        </w:rPr>
+        <w:t>builder.build())</w:t>
+      </w:r>
+      <w:r>
+        <w:rPr>
+          <w:rFonts w:ascii="Courier New" w:eastAsia="Times New Roman" w:hAnsi="Courier New" w:cs="Courier New"/>
+          <w:color w:val="CC7832"/>
+          <w:sz w:val="20"/>
+          <w:szCs w:val="20"/>
+          <w:lang w:eastAsia="en-IN"/>
+        </w:rPr>
+        <w:t>;</w:t>
+      </w:r>
+      <w:r>
+        <w:rPr>
+          <w:rFonts w:ascii="Courier New" w:eastAsia="Times New Roman" w:hAnsi="Courier New" w:cs="Courier New"/>
+          <w:color w:val="CC7832"/>
+          <w:sz w:val="20"/>
+          <w:szCs w:val="20"/>
+          <w:lang w:eastAsia="en-IN"/>
+        </w:rPr>
+        <w:br/>
+        <w:t xml:space="preserve">    </w:t>
+      </w:r>
+      <w:r>
+        <w:rPr>
+          <w:rFonts w:ascii="Courier New" w:eastAsia="Times New Roman" w:hAnsi="Courier New" w:cs="Courier New"/>
+          <w:color w:val="A9B7C6"/>
+          <w:sz w:val="20"/>
+          <w:szCs w:val="20"/>
+          <w:lang w:eastAsia="en-IN"/>
+        </w:rPr>
+        <w:t>}</w:t>
+      </w:r>
+      <w:r>
+        <w:rPr>
+          <w:rFonts w:ascii="Courier New" w:eastAsia="Times New Roman" w:hAnsi="Courier New" w:cs="Courier New"/>
+          <w:color w:val="A9B7C6"/>
+          <w:sz w:val="20"/>
+          <w:szCs w:val="20"/>
+          <w:lang w:eastAsia="en-IN"/>
+        </w:rPr>
+        <w:br/>
+        <w:t>}</w:t>
+      </w:r>
+    </w:p>
+    <w:p>
+      <w:pPr>
+        <w:tabs>
+          <w:tab w:val="left" w:pos="6525"/>
+        </w:tabs>
+      </w:pPr>
+    </w:p>
+    <w:p>
+      <w:pPr>
+        <w:tabs>
+          <w:tab w:val="left" w:pos="6525"/>
+        </w:tabs>
+      </w:pPr>
+    </w:p>
+    <w:p>
+      <w:pPr>
+        <w:tabs>
+          <w:tab w:val="left" w:pos="6525"/>
+        </w:tabs>
+        <w:rPr>
+          <w:lang w:val="en-US"/>
+        </w:rPr>
+      </w:pPr>
+    </w:p>
+    <w:p>
+      <w:pPr>
+        <w:tabs>
+          <w:tab w:val="left" w:pos="6525"/>
+        </w:tabs>
+        <w:rPr>
+          <w:lang w:val="en-US"/>
+        </w:rPr>
       </w:pPr>
     </w:p>
     <w:p>
@@ -1225,6 +2057,7 @@
   <w:style w:type="character" w:default="1" w:styleId="DefaultParagraphFont">
     <w:name w:val="Default Paragraph Font"/>
     <w:uiPriority w:val="1"/>
+    <w:semiHidden/>
     <w:unhideWhenUsed/>
   </w:style>
   <w:style w:type="table" w:default="1" w:styleId="TableNormal">

</xml_diff>